<commit_message>
Add Montana master contract as lead Past Performance anchor
Capability Statement: State of Montana Master AI Products & Services
Contract (SPB26-0608GW-VSNBLX) now leads the Past Performance block with a
gold "PRIME" accent — the only competitively-awarded public master contract,
NDA-clean, countering the mostly-private-sector read. Healthcare-system
anchor renamed to "Leading National Integrated Healthcare System" and
urgent-care mapped to HL7/FHIR ETL; values shown as approximate. Still one page.

Partner Profile: added "Awarded Contract Vehicle" (Montana) and
"Representative Past Performance" rows to Company Information; capability
keyword strings left byte-for-byte unchanged for catalog ingestion.

Co-Authored-By: Claude Opus 4.8 <noreply@anthropic.com>
Claude-Session: https://claude.ai/code/session_01LmRQQmfSx6pX17YBkF9TKz
</commit_message>
<xml_diff>
--- a/branded_docs/CapabilityStatement_Visionblox_v3.1_2026-08.docx
+++ b/branded_docs/CapabilityStatement_Visionblox_v3.1_2026-08.docx
@@ -785,7 +785,7 @@
             </w:tcMar>
             <w:tcBorders>
               <w:top w:val="nil"/>
-              <w:left w:val="nil"/>
+              <w:left w:val="single" w:sz="26" w:space="0" w:color="F7B801"/>
               <w:bottom w:val="single" w:sz="4" w:space="0" w:color="D9DEE6"/>
               <w:right w:val="nil"/>
             </w:tcBorders>
@@ -799,10 +799,22 @@
                 <w:rFonts w:ascii="Arial" w:hAnsi="Arial" w:cs="Arial"/>
                 <w:b/>
                 <w:i w:val="0"/>
+                <w:color w:val="F7B801"/>
+                <w:sz w:val="13"/>
+                <w:caps w:val="1"/>
+                <w:spacing w:val="30"/>
+              </w:rPr>
+              <w:t xml:space="preserve">PRIME  </w:t>
+            </w:r>
+            <w:r>
+              <w:rPr>
+                <w:rFonts w:ascii="Arial" w:hAnsi="Arial" w:cs="Arial"/>
+                <w:b/>
+                <w:i w:val="0"/>
                 <w:color w:val="232D5A"/>
                 <w:sz w:val="16"/>
               </w:rPr>
-              <w:t>Patient Portal &amp; EHR Integration — National Integrated Health System</w:t>
+              <w:t>State of Montana — Master AI Products &amp; Services Contract (SPB26-0608GW-VSNBLX)</w:t>
             </w:r>
           </w:p>
         </w:tc>
@@ -836,7 +848,7 @@
                 <w:color w:val="2E2E2E"/>
                 <w:sz w:val="15"/>
               </w:rPr>
-              <w:t>Epic/HL7 integration, Cures Act-compliant patient portal serving 100K+ daily users at 99.8% SLA</w:t>
+              <w:t>Competitively awarded statewide master contract — both tracks, executed Aug 2026. AI software solutions for state government operations.</w:t>
             </w:r>
           </w:p>
         </w:tc>
@@ -860,7 +872,7 @@
           </w:tcPr>
           <w:p>
             <w:pPr>
-              <w:spacing w:before="0" w:after="0"/>
+              <w:spacing w:before="0" w:after="0" w:line="245" w:lineRule="auto"/>
               <w:jc w:val="right"/>
             </w:pPr>
             <w:r>
@@ -871,7 +883,20 @@
                 <w:color w:val="232D5A"/>
                 <w:sz w:val="19"/>
               </w:rPr>
-              <w:t>$1.2M</w:t>
+              <w:t>Through 2028</w:t>
+            </w:r>
+            <w:r>
+              <w:br/>
+            </w:r>
+            <w:r>
+              <w:rPr>
+                <w:rFonts w:ascii="Arial" w:hAnsi="Arial" w:cs="Arial"/>
+                <w:b w:val="0"/>
+                <w:i w:val="0"/>
+                <w:color w:val="2EA891"/>
+                <w:sz w:val="13"/>
+              </w:rPr>
+              <w:t>Cooperative · nationwide</w:t>
             </w:r>
           </w:p>
         </w:tc>
@@ -910,7 +935,7 @@
                 <w:color w:val="232D5A"/>
                 <w:sz w:val="16"/>
               </w:rPr>
-              <w:t>CA DHCS Claims &amp; Fiscal Reporting System (CFRS) — State Medicaid</w:t>
+              <w:t>Patient Portal &amp; EHR Integration — Leading National Integrated Healthcare System</w:t>
             </w:r>
           </w:p>
         </w:tc>
@@ -944,7 +969,7 @@
                 <w:color w:val="2E2E2E"/>
                 <w:sz w:val="15"/>
               </w:rPr>
-              <w:t>MITA-compliant modernization; AI document intelligence at 96% OCR accuracy; 60% labor reduction</w:t>
+              <w:t>Epic/HL7 &amp; Cures Act integration; patient portal serving 100K+ daily users at 99.8% SLA</w:t>
             </w:r>
           </w:p>
         </w:tc>
@@ -968,7 +993,7 @@
           </w:tcPr>
           <w:p>
             <w:pPr>
-              <w:spacing w:before="0" w:after="0"/>
+              <w:spacing w:before="0" w:after="0" w:line="245" w:lineRule="auto"/>
               <w:jc w:val="right"/>
             </w:pPr>
             <w:r>
@@ -979,7 +1004,7 @@
                 <w:color w:val="232D5A"/>
                 <w:sz w:val="19"/>
               </w:rPr>
-              <w:t>$2.1M</w:t>
+              <w:t>~$1.2M</w:t>
             </w:r>
           </w:p>
         </w:tc>
@@ -1018,7 +1043,7 @@
                 <w:color w:val="232D5A"/>
                 <w:sz w:val="16"/>
               </w:rPr>
-              <w:t>Claims Processing Modernization — National Health Insurer</w:t>
+              <w:t>CA DHCS Claims &amp; Fiscal Reporting System (CFRS) — State Medicaid</w:t>
             </w:r>
           </w:p>
         </w:tc>
@@ -1052,7 +1077,7 @@
                 <w:color w:val="2E2E2E"/>
                 <w:sz w:val="15"/>
               </w:rPr>
-              <w:t>AWS Batch/Lambda/EMR pipeline processing millions of daily claims</w:t>
+              <w:t>MITA-compliant modernization; AI document intelligence at 96% OCR accuracy; 60% labor reduction</w:t>
             </w:r>
           </w:p>
         </w:tc>
@@ -1076,7 +1101,7 @@
           </w:tcPr>
           <w:p>
             <w:pPr>
-              <w:spacing w:before="0" w:after="0"/>
+              <w:spacing w:before="0" w:after="0" w:line="245" w:lineRule="auto"/>
               <w:jc w:val="right"/>
             </w:pPr>
             <w:r>
@@ -1087,7 +1112,7 @@
                 <w:color w:val="232D5A"/>
                 <w:sz w:val="19"/>
               </w:rPr>
-              <w:t>Enterprise</w:t>
+              <w:t>~$2.1M</w:t>
             </w:r>
           </w:p>
         </w:tc>
@@ -1126,7 +1151,7 @@
                 <w:color w:val="232D5A"/>
                 <w:sz w:val="16"/>
               </w:rPr>
-              <w:t>Urgent Care Data Integration — Regional Health Network</w:t>
+              <w:t>Claims Processing Modernization — National Health Insurer</w:t>
             </w:r>
           </w:p>
         </w:tc>
@@ -1160,7 +1185,7 @@
                 <w:color w:val="2E2E2E"/>
                 <w:sz w:val="15"/>
               </w:rPr>
-              <w:t>HL7 ETL, microservices architecture, PHI-secure AWS environment</w:t>
+              <w:t>AWS Batch/Lambda/EMR pipeline processing millions of daily claims</w:t>
             </w:r>
           </w:p>
         </w:tc>
@@ -1184,7 +1209,115 @@
           </w:tcPr>
           <w:p>
             <w:pPr>
-              <w:spacing w:before="0" w:after="0"/>
+              <w:spacing w:before="0" w:after="0" w:line="245" w:lineRule="auto"/>
+              <w:jc w:val="right"/>
+            </w:pPr>
+            <w:r>
+              <w:rPr>
+                <w:rFonts w:ascii="Arial" w:hAnsi="Arial" w:cs="Arial"/>
+                <w:b/>
+                <w:i w:val="0"/>
+                <w:color w:val="232D5A"/>
+                <w:sz w:val="19"/>
+              </w:rPr>
+              <w:t>Enterprise</w:t>
+            </w:r>
+          </w:p>
+        </w:tc>
+      </w:tr>
+      <w:tr>
+        <w:trPr>
+          <w:cantSplit/>
+        </w:trPr>
+        <w:tc>
+          <w:tcPr>
+            <w:tcW w:w="5112" w:type="dxa"/>
+            <w:shd w:val="clear" w:color="auto" w:fill="FFFFFF"/>
+            <w:vAlign w:val="center"/>
+            <w:tcMar>
+              <w:top w:w="75" w:type="dxa"/>
+              <w:left w:w="120" w:type="dxa"/>
+              <w:bottom w:w="75" w:type="dxa"/>
+              <w:right w:w="120" w:type="dxa"/>
+            </w:tcMar>
+            <w:tcBorders>
+              <w:top w:val="nil"/>
+              <w:left w:val="nil"/>
+              <w:bottom w:val="single" w:sz="4" w:space="0" w:color="D9DEE6"/>
+              <w:right w:val="nil"/>
+            </w:tcBorders>
+          </w:tcPr>
+          <w:p>
+            <w:pPr>
+              <w:spacing w:before="0" w:after="0" w:line="247" w:lineRule="auto"/>
+            </w:pPr>
+            <w:r>
+              <w:rPr>
+                <w:rFonts w:ascii="Arial" w:hAnsi="Arial" w:cs="Arial"/>
+                <w:b/>
+                <w:i w:val="0"/>
+                <w:color w:val="232D5A"/>
+                <w:sz w:val="16"/>
+              </w:rPr>
+              <w:t>Urgent Care Data Integration — Regional Health Network</w:t>
+            </w:r>
+          </w:p>
+        </w:tc>
+        <w:tc>
+          <w:tcPr>
+            <w:tcW w:w="3960" w:type="dxa"/>
+            <w:shd w:val="clear" w:color="auto" w:fill="FFFFFF"/>
+            <w:vAlign w:val="center"/>
+            <w:tcMar>
+              <w:top w:w="75" w:type="dxa"/>
+              <w:left w:w="120" w:type="dxa"/>
+              <w:bottom w:w="75" w:type="dxa"/>
+              <w:right w:w="120" w:type="dxa"/>
+            </w:tcMar>
+            <w:tcBorders>
+              <w:top w:val="nil"/>
+              <w:left w:val="nil"/>
+              <w:bottom w:val="single" w:sz="4" w:space="0" w:color="D9DEE6"/>
+              <w:right w:val="nil"/>
+            </w:tcBorders>
+          </w:tcPr>
+          <w:p>
+            <w:pPr>
+              <w:spacing w:before="0" w:after="0" w:line="247" w:lineRule="auto"/>
+            </w:pPr>
+            <w:r>
+              <w:rPr>
+                <w:rFonts w:ascii="Arial" w:hAnsi="Arial" w:cs="Arial"/>
+                <w:b w:val="0"/>
+                <w:i w:val="0"/>
+                <w:color w:val="2E2E2E"/>
+                <w:sz w:val="15"/>
+              </w:rPr>
+              <w:t>HL7/FHIR ETL, microservices architecture, PHI-secure AWS environment</w:t>
+            </w:r>
+          </w:p>
+        </w:tc>
+        <w:tc>
+          <w:tcPr>
+            <w:tcW w:w="1728" w:type="dxa"/>
+            <w:shd w:val="clear" w:color="auto" w:fill="FFFFFF"/>
+            <w:vAlign w:val="center"/>
+            <w:tcMar>
+              <w:top w:w="75" w:type="dxa"/>
+              <w:left w:w="120" w:type="dxa"/>
+              <w:bottom w:w="75" w:type="dxa"/>
+              <w:right w:w="120" w:type="dxa"/>
+            </w:tcMar>
+            <w:tcBorders>
+              <w:top w:val="nil"/>
+              <w:left w:val="single" w:sz="18" w:space="0" w:color="F7B801"/>
+              <w:bottom w:val="single" w:sz="4" w:space="0" w:color="D9DEE6"/>
+              <w:right w:val="nil"/>
+            </w:tcBorders>
+          </w:tcPr>
+          <w:p>
+            <w:pPr>
+              <w:spacing w:before="0" w:after="0" w:line="245" w:lineRule="auto"/>
               <w:jc w:val="right"/>
             </w:pPr>
             <w:r>

</xml_diff>